<commit_message>
fix: correct fulfillment subsystem direction and add retry mechanism detail
Clarified that the system ingests events FROM sales channels (not pushes
inventory to them), and that downstream consumers handle inventory adjustment.
Added exponential backoff and batch table retry detail to talking points.
Added Tesla evidence of excellence.

Co-Authored-By: Claude Sonnet 4.6 <noreply@anthropic.com>
</commit_message>
<xml_diff>
--- a/resume/Krishnakumar-CV.docx
+++ b/resume/Krishnakumar-CV.docx
@@ -397,7 +397,7 @@
           <w:color w:val="1A1A1A"/>
           <w:sz w:val="20"/>
         </w:rPr>
-        <w:t xml:space="preserve"> a fault-tolerant fulfillment subsystem syncing across </w:t>
+        <w:t xml:space="preserve"> a fault-tolerant fulfillment subsystem ingesting events from </w:t>
       </w:r>
       <w:r>
         <w:rPr>
@@ -413,7 +413,7 @@
           <w:color w:val="1A1A1A"/>
           <w:sz w:val="20"/>
         </w:rPr>
-        <w:t xml:space="preserve"> (hundreds of thousands of events per day), designed for idempotent consumers, ordered delivery, and safe recovery under partial failures. Scaled it to sustain </w:t>
+        <w:t xml:space="preserve"> (hundreds of thousands of events per day), designed for idempotent consumers, ordered delivery, and safe recovery under partial failures. Fulfillment events are linked to upstream product and variant entities before being published for downstream inventory consumers, making ordering a core design constraint. Scaled the pipeline to sustain </w:t>
       </w:r>
       <w:r>
         <w:rPr>
@@ -429,7 +429,7 @@
           <w:color w:val="1A1A1A"/>
           <w:sz w:val="20"/>
         </w:rPr>
-        <w:t xml:space="preserve"> through database partitioning, sharding, and load-based autoscaling, verifying the throughput with custom load-generation scripts.</w:t>
+        <w:t xml:space="preserve"> through database partitioning, sharding, and load-based autoscaling, verifying throughput with custom load-generation scripts.</w:t>
       </w:r>
     </w:p>
     <w:p>

</xml_diff>

<commit_message>
Save state before starting interview prep setup
</commit_message>
<xml_diff>
--- a/resume/Krishnakumar-CV.docx
+++ b/resume/Krishnakumar-CV.docx
@@ -6,6 +6,7 @@
       <w:pPr>
         <w:spacing w:after="40"/>
         <w:jc w:val="center"/>
+        <w:outlineLvl w:val="0"/>
       </w:pPr>
       <w:r>
         <w:rPr>
@@ -73,6 +74,7 @@
     <w:p>
       <w:pPr>
         <w:spacing w:before="160" w:after="60"/>
+        <w:outlineLvl w:val="1"/>
         <w:pBdr>
           <w:bottom w:val="single" w:sz="6" w:space="2" w:color="999999"/>
         </w:pBdr>
@@ -199,6 +201,7 @@
     <w:p>
       <w:pPr>
         <w:spacing w:before="160" w:after="60"/>
+        <w:outlineLvl w:val="1"/>
         <w:pBdr>
           <w:bottom w:val="single" w:sz="6" w:space="2" w:color="999999"/>
         </w:pBdr>
@@ -792,6 +795,7 @@
     <w:p>
       <w:pPr>
         <w:spacing w:before="160" w:after="60"/>
+        <w:outlineLvl w:val="1"/>
         <w:pBdr>
           <w:bottom w:val="single" w:sz="6" w:space="2" w:color="999999"/>
         </w:pBdr>
@@ -867,6 +871,7 @@
     <w:p>
       <w:pPr>
         <w:spacing w:before="160" w:after="60"/>
+        <w:outlineLvl w:val="1"/>
         <w:pBdr>
           <w:bottom w:val="single" w:sz="6" w:space="2" w:color="999999"/>
         </w:pBdr>

</xml_diff>